<commit_message>
fix(word): remove the paragraph whose mark was moved away
AcceptMoveFromMoveToTransform removed every w:moveFrom, including the
marker of a moved-from paragraph mark (w:pPr/w:rPr/w:moveFrom), before
AcceptDeletedAndMoveFromParagraphMarks could join that paragraph with
the next. Accept All therefore left an empty paragraph where a moved
paragraph had been, and Reject All (which swaps moveFrom and moveTo,
then accepts) left one where it had gone. Word leaves neither.

Keep a moved-from paragraph mark as a deleted one so the existing
deleted-paragraph-mark handling applies. The RP015 baselines recorded
the empty paragraph; drop it from both (RP018, the same move inside a
content control, already expected none).
</commit_message>
<xml_diff>
--- a/TestFiles/RP/RP015-MoveFrom-MoveTo-Accepted.docx
+++ b/TestFiles/RP/RP015-MoveFrom-MoveTo-Accepted.docx
@@ -14,13 +14,6 @@
         </w:rPr>
         <w:t>Video provides a powerful way.</w:t>
       </w:r>
-    </w:p>
-    <w:p>
-      <w:pPr>
-        <w:rPr>
-          <w:lang w:val="en-US"/>
-        </w:rPr>
-      </w:pPr>
     </w:p>
     <w:p>
       <w:pPr>

</xml_diff>

<commit_message>
fix(word): remove the paragraph whose mark was moved away (#552)
AcceptMoveFromMoveToTransform removed every w:moveFrom, including the
marker of a moved-from paragraph mark (w:pPr/w:rPr/w:moveFrom), before
AcceptDeletedAndMoveFromParagraphMarks could join that paragraph with
the next. Accept All therefore left an empty paragraph where a moved
paragraph had been, and Reject All (which swaps moveFrom and moveTo,
then accepts) left one where it had gone. Word leaves neither.

Keep a moved-from paragraph mark as a deleted one so the existing
deleted-paragraph-mark handling applies. The RP015 baselines recorded
the empty paragraph; drop it from both (RP018, the same move inside a
content control, already expected none).

The test lives in its own partial-class file so that concurrent
RevisionProcessor fixes do not edit the same lines.
</commit_message>
<xml_diff>
--- a/TestFiles/RP/RP015-MoveFrom-MoveTo-Accepted.docx
+++ b/TestFiles/RP/RP015-MoveFrom-MoveTo-Accepted.docx
@@ -14,13 +14,6 @@
         </w:rPr>
         <w:t>Video provides a powerful way.</w:t>
       </w:r>
-    </w:p>
-    <w:p>
-      <w:pPr>
-        <w:rPr>
-          <w:lang w:val="en-US"/>
-        </w:rPr>
-      </w:pPr>
     </w:p>
     <w:p>
       <w:pPr>

</xml_diff>